<commit_message>
Create initial time plan document
</commit_message>
<xml_diff>
--- a/docs/Report/Initial Time Plan.docx
+++ b/docs/Report/Initial Time Plan.docx
@@ -7,31 +7,566 @@
         <w:pStyle w:val="Heading1"/>
       </w:pPr>
       <w:r>
-        <w:t>Heading</w:t>
-      </w:r>
-      <w:r>
-        <w:t xml:space="preserve"> </w:t>
+        <w:t>Initial Time Plan</w:t>
       </w:r>
     </w:p>
     <w:p>
       <w:pPr>
-        <w:jc w:val="both"/>
-      </w:pPr>
+        <w:pStyle w:val="Heading2"/>
+      </w:pPr>
+      <w:r>
+        <w:t>Partitions</w:t>
+      </w:r>
     </w:p>
     <w:p>
       <w:pPr>
-        <w:jc w:val="both"/>
-      </w:pPr>
+        <w:tabs>
+          <w:tab w:val="left" w:pos="720"/>
+          <w:tab w:val="left" w:pos="1440"/>
+          <w:tab w:val="left" w:pos="2160"/>
+          <w:tab w:val="left" w:pos="2880"/>
+          <w:tab w:val="left" w:pos="6255"/>
+        </w:tabs>
+        <w:rPr>
+          <w:b/>
+          <w:bCs/>
+        </w:rPr>
+      </w:pPr>
+      <w:r>
+        <w:rPr>
+          <w:b/>
+          <w:bCs/>
+        </w:rPr>
+        <w:t>The project would be split into:</w:t>
+      </w:r>
     </w:p>
     <w:p>
       <w:pPr>
-        <w:jc w:val="both"/>
-      </w:pPr>
+        <w:pStyle w:val="ListParagraph"/>
+        <w:numPr>
+          <w:ilvl w:val="0"/>
+          <w:numId w:val="6"/>
+        </w:numPr>
+        <w:tabs>
+          <w:tab w:val="left" w:pos="720"/>
+          <w:tab w:val="left" w:pos="1440"/>
+          <w:tab w:val="left" w:pos="2160"/>
+          <w:tab w:val="left" w:pos="2880"/>
+          <w:tab w:val="left" w:pos="6255"/>
+        </w:tabs>
+      </w:pPr>
+      <w:r>
+        <w:t>Pre-phase I planning and tasks.</w:t>
+      </w:r>
     </w:p>
     <w:p>
       <w:pPr>
+        <w:pStyle w:val="ListParagraph"/>
+        <w:numPr>
+          <w:ilvl w:val="0"/>
+          <w:numId w:val="6"/>
+        </w:numPr>
+        <w:tabs>
+          <w:tab w:val="left" w:pos="720"/>
+          <w:tab w:val="left" w:pos="1440"/>
+          <w:tab w:val="left" w:pos="2160"/>
+          <w:tab w:val="left" w:pos="2880"/>
+          <w:tab w:val="left" w:pos="6255"/>
+        </w:tabs>
+      </w:pPr>
+      <w:r>
+        <w:t>Three sprints for the project itself.</w:t>
+      </w:r>
+    </w:p>
+    <w:p>
+      <w:pPr>
+        <w:pStyle w:val="ListParagraph"/>
+        <w:numPr>
+          <w:ilvl w:val="0"/>
+          <w:numId w:val="6"/>
+        </w:numPr>
+        <w:tabs>
+          <w:tab w:val="left" w:pos="720"/>
+          <w:tab w:val="left" w:pos="1440"/>
+          <w:tab w:val="left" w:pos="2160"/>
+          <w:tab w:val="left" w:pos="2880"/>
+          <w:tab w:val="left" w:pos="6255"/>
+        </w:tabs>
+      </w:pPr>
+      <w:r>
+        <w:t>Final tasks before phase II submission.</w:t>
+      </w:r>
+    </w:p>
+    <w:p>
+      <w:pPr>
+        <w:tabs>
+          <w:tab w:val="left" w:pos="720"/>
+          <w:tab w:val="left" w:pos="1440"/>
+          <w:tab w:val="left" w:pos="2160"/>
+          <w:tab w:val="left" w:pos="2880"/>
+          <w:tab w:val="left" w:pos="6255"/>
+        </w:tabs>
+        <w:rPr>
+          <w:b/>
+          <w:bCs/>
+        </w:rPr>
+      </w:pPr>
+      <w:r>
+        <w:rPr>
+          <w:b/>
+          <w:bCs/>
+        </w:rPr>
+        <w:t>And all the charts are based on this legend:</w:t>
+      </w:r>
+    </w:p>
+    <w:p>
+      <w:pPr>
+        <w:tabs>
+          <w:tab w:val="left" w:pos="720"/>
+          <w:tab w:val="left" w:pos="1440"/>
+          <w:tab w:val="left" w:pos="2160"/>
+          <w:tab w:val="left" w:pos="2880"/>
+          <w:tab w:val="left" w:pos="6255"/>
+        </w:tabs>
+        <w:rPr>
+          <w:rtl/>
+        </w:rPr>
+      </w:pPr>
+      <w:r>
+        <w:rPr>
+          <w:noProof/>
+        </w:rPr>
+        <w:drawing>
+          <wp:inline distT="0" distB="0" distL="0" distR="0" wp14:anchorId="6AC4AA26" wp14:editId="3D040D63">
+            <wp:extent cx="5274310" cy="150495"/>
+            <wp:effectExtent l="133350" t="152400" r="345440" b="363855"/>
+            <wp:docPr id="8" name="Picture 8"/>
+            <wp:cNvGraphicFramePr>
+              <a:graphicFrameLocks xmlns:a="http://schemas.openxmlformats.org/drawingml/2006/main" noChangeAspect="1"/>
+            </wp:cNvGraphicFramePr>
+            <a:graphic xmlns:a="http://schemas.openxmlformats.org/drawingml/2006/main">
+              <a:graphicData uri="http://schemas.openxmlformats.org/drawingml/2006/picture">
+                <pic:pic xmlns:pic="http://schemas.openxmlformats.org/drawingml/2006/picture">
+                  <pic:nvPicPr>
+                    <pic:cNvPr id="0" name="Picture 20"/>
+                    <pic:cNvPicPr>
+                      <a:picLocks noChangeAspect="1" noChangeArrowheads="1"/>
+                    </pic:cNvPicPr>
+                  </pic:nvPicPr>
+                  <pic:blipFill>
+                    <a:blip r:embed="rId5" cstate="print">
+                      <a:extLst>
+                        <a:ext uri="{28A0092B-C50C-407E-A947-70E740481C1C}">
+                          <a14:useLocalDpi xmlns:a14="http://schemas.microsoft.com/office/drawing/2010/main" val="0"/>
+                        </a:ext>
+                      </a:extLst>
+                    </a:blip>
+                    <a:srcRect/>
+                    <a:stretch>
+                      <a:fillRect/>
+                    </a:stretch>
+                  </pic:blipFill>
+                  <pic:spPr bwMode="auto">
+                    <a:xfrm>
+                      <a:off x="0" y="0"/>
+                      <a:ext cx="5274310" cy="150495"/>
+                    </a:xfrm>
+                    <a:prstGeom prst="rect">
+                      <a:avLst/>
+                    </a:prstGeom>
+                    <a:ln>
+                      <a:noFill/>
+                    </a:ln>
+                    <a:effectLst>
+                      <a:outerShdw blurRad="292100" dist="139700" dir="2700000" algn="tl" rotWithShape="0">
+                        <a:srgbClr val="333333">
+                          <a:alpha val="65000"/>
+                        </a:srgbClr>
+                      </a:outerShdw>
+                    </a:effectLst>
+                  </pic:spPr>
+                </pic:pic>
+              </a:graphicData>
+            </a:graphic>
+          </wp:inline>
+        </w:drawing>
+      </w:r>
+    </w:p>
+    <w:p>
+      <w:pPr>
+        <w:tabs>
+          <w:tab w:val="left" w:pos="720"/>
+          <w:tab w:val="left" w:pos="1440"/>
+          <w:tab w:val="left" w:pos="2160"/>
+          <w:tab w:val="left" w:pos="2880"/>
+          <w:tab w:val="left" w:pos="6255"/>
+        </w:tabs>
+      </w:pPr>
+    </w:p>
+    <w:p>
+      <w:pPr>
+        <w:pStyle w:val="Heading2"/>
+      </w:pPr>
+      <w:r>
+        <w:t>Phase I Submission</w:t>
+      </w:r>
+    </w:p>
+    <w:p>
+      <w:r>
+        <w:rPr>
+          <w:noProof/>
+        </w:rPr>
+        <w:drawing>
+          <wp:inline distT="0" distB="0" distL="0" distR="0" wp14:anchorId="7445A96C" wp14:editId="3B80D7CC">
+            <wp:extent cx="5274310" cy="2567940"/>
+            <wp:effectExtent l="152400" t="152400" r="364490" b="365760"/>
+            <wp:docPr id="1" name="Picture 1"/>
+            <wp:cNvGraphicFramePr>
+              <a:graphicFrameLocks xmlns:a="http://schemas.openxmlformats.org/drawingml/2006/main" noChangeAspect="1"/>
+            </wp:cNvGraphicFramePr>
+            <a:graphic xmlns:a="http://schemas.openxmlformats.org/drawingml/2006/main">
+              <a:graphicData uri="http://schemas.openxmlformats.org/drawingml/2006/picture">
+                <pic:pic xmlns:pic="http://schemas.openxmlformats.org/drawingml/2006/picture">
+                  <pic:nvPicPr>
+                    <pic:cNvPr id="0" name="Picture 1"/>
+                    <pic:cNvPicPr>
+                      <a:picLocks noChangeAspect="1" noChangeArrowheads="1"/>
+                    </pic:cNvPicPr>
+                  </pic:nvPicPr>
+                  <pic:blipFill>
+                    <a:blip r:embed="rId6">
+                      <a:extLst>
+                        <a:ext uri="{28A0092B-C50C-407E-A947-70E740481C1C}">
+                          <a14:useLocalDpi xmlns:a14="http://schemas.microsoft.com/office/drawing/2010/main" val="0"/>
+                        </a:ext>
+                      </a:extLst>
+                    </a:blip>
+                    <a:srcRect/>
+                    <a:stretch>
+                      <a:fillRect/>
+                    </a:stretch>
+                  </pic:blipFill>
+                  <pic:spPr bwMode="auto">
+                    <a:xfrm>
+                      <a:off x="0" y="0"/>
+                      <a:ext cx="5274310" cy="2567940"/>
+                    </a:xfrm>
+                    <a:prstGeom prst="rect">
+                      <a:avLst/>
+                    </a:prstGeom>
+                    <a:ln>
+                      <a:noFill/>
+                    </a:ln>
+                    <a:effectLst>
+                      <a:outerShdw blurRad="292100" dist="139700" dir="2700000" algn="tl" rotWithShape="0">
+                        <a:srgbClr val="333333">
+                          <a:alpha val="65000"/>
+                        </a:srgbClr>
+                      </a:outerShdw>
+                    </a:effectLst>
+                  </pic:spPr>
+                </pic:pic>
+              </a:graphicData>
+            </a:graphic>
+          </wp:inline>
+        </w:drawing>
+      </w:r>
+    </w:p>
+    <w:p>
+      <w:pPr>
+        <w:pStyle w:val="Heading2"/>
+      </w:pPr>
+      <w:r>
+        <w:lastRenderedPageBreak/>
+        <w:t>Sprint 1</w:t>
+      </w:r>
+    </w:p>
+    <w:p>
+      <w:pPr>
+        <w:rPr>
+          <w:rtl/>
+        </w:rPr>
+      </w:pPr>
+      <w:r>
+        <w:rPr>
+          <w:noProof/>
+        </w:rPr>
+        <w:drawing>
+          <wp:inline distT="0" distB="0" distL="0" distR="0" wp14:anchorId="04DDBD36" wp14:editId="11E52FE6">
+            <wp:extent cx="5274310" cy="2035175"/>
+            <wp:effectExtent l="152400" t="152400" r="364490" b="365125"/>
+            <wp:docPr id="3" name="Picture 3"/>
+            <wp:cNvGraphicFramePr>
+              <a:graphicFrameLocks xmlns:a="http://schemas.openxmlformats.org/drawingml/2006/main" noChangeAspect="1"/>
+            </wp:cNvGraphicFramePr>
+            <a:graphic xmlns:a="http://schemas.openxmlformats.org/drawingml/2006/main">
+              <a:graphicData uri="http://schemas.openxmlformats.org/drawingml/2006/picture">
+                <pic:pic xmlns:pic="http://schemas.openxmlformats.org/drawingml/2006/picture">
+                  <pic:nvPicPr>
+                    <pic:cNvPr id="0" name="Picture 7"/>
+                    <pic:cNvPicPr>
+                      <a:picLocks noChangeAspect="1" noChangeArrowheads="1"/>
+                    </pic:cNvPicPr>
+                  </pic:nvPicPr>
+                  <pic:blipFill>
+                    <a:blip r:embed="rId7" cstate="print">
+                      <a:extLst>
+                        <a:ext uri="{28A0092B-C50C-407E-A947-70E740481C1C}">
+                          <a14:useLocalDpi xmlns:a14="http://schemas.microsoft.com/office/drawing/2010/main" val="0"/>
+                        </a:ext>
+                      </a:extLst>
+                    </a:blip>
+                    <a:srcRect/>
+                    <a:stretch>
+                      <a:fillRect/>
+                    </a:stretch>
+                  </pic:blipFill>
+                  <pic:spPr bwMode="auto">
+                    <a:xfrm>
+                      <a:off x="0" y="0"/>
+                      <a:ext cx="5274310" cy="2035175"/>
+                    </a:xfrm>
+                    <a:prstGeom prst="rect">
+                      <a:avLst/>
+                    </a:prstGeom>
+                    <a:ln>
+                      <a:noFill/>
+                    </a:ln>
+                    <a:effectLst>
+                      <a:outerShdw blurRad="292100" dist="139700" dir="2700000" algn="tl" rotWithShape="0">
+                        <a:srgbClr val="333333">
+                          <a:alpha val="65000"/>
+                        </a:srgbClr>
+                      </a:outerShdw>
+                    </a:effectLst>
+                  </pic:spPr>
+                </pic:pic>
+              </a:graphicData>
+            </a:graphic>
+          </wp:inline>
+        </w:drawing>
+      </w:r>
+    </w:p>
+    <w:p/>
+    <w:p>
+      <w:pPr>
+        <w:pStyle w:val="Heading2"/>
+      </w:pPr>
+      <w:r>
+        <w:t>Sprint 2</w:t>
+      </w:r>
+    </w:p>
+    <w:p>
+      <w:pPr>
         <w:jc w:val="both"/>
       </w:pPr>
+      <w:r>
+        <w:rPr>
+          <w:noProof/>
+        </w:rPr>
+        <w:drawing>
+          <wp:inline distT="0" distB="0" distL="0" distR="0" wp14:anchorId="6BEAD5C6" wp14:editId="707F811C">
+            <wp:extent cx="5274310" cy="2067560"/>
+            <wp:effectExtent l="152400" t="152400" r="364490" b="370840"/>
+            <wp:docPr id="4" name="Picture 4"/>
+            <wp:cNvGraphicFramePr>
+              <a:graphicFrameLocks xmlns:a="http://schemas.openxmlformats.org/drawingml/2006/main" noChangeAspect="1"/>
+            </wp:cNvGraphicFramePr>
+            <a:graphic xmlns:a="http://schemas.openxmlformats.org/drawingml/2006/main">
+              <a:graphicData uri="http://schemas.openxmlformats.org/drawingml/2006/picture">
+                <pic:pic xmlns:pic="http://schemas.openxmlformats.org/drawingml/2006/picture">
+                  <pic:nvPicPr>
+                    <pic:cNvPr id="0" name="Picture 9"/>
+                    <pic:cNvPicPr>
+                      <a:picLocks noChangeAspect="1" noChangeArrowheads="1"/>
+                    </pic:cNvPicPr>
+                  </pic:nvPicPr>
+                  <pic:blipFill>
+                    <a:blip r:embed="rId8" cstate="print">
+                      <a:extLst>
+                        <a:ext uri="{28A0092B-C50C-407E-A947-70E740481C1C}">
+                          <a14:useLocalDpi xmlns:a14="http://schemas.microsoft.com/office/drawing/2010/main" val="0"/>
+                        </a:ext>
+                      </a:extLst>
+                    </a:blip>
+                    <a:srcRect/>
+                    <a:stretch>
+                      <a:fillRect/>
+                    </a:stretch>
+                  </pic:blipFill>
+                  <pic:spPr bwMode="auto">
+                    <a:xfrm>
+                      <a:off x="0" y="0"/>
+                      <a:ext cx="5274310" cy="2067560"/>
+                    </a:xfrm>
+                    <a:prstGeom prst="rect">
+                      <a:avLst/>
+                    </a:prstGeom>
+                    <a:ln>
+                      <a:noFill/>
+                    </a:ln>
+                    <a:effectLst>
+                      <a:outerShdw blurRad="292100" dist="139700" dir="2700000" algn="tl" rotWithShape="0">
+                        <a:srgbClr val="333333">
+                          <a:alpha val="65000"/>
+                        </a:srgbClr>
+                      </a:outerShdw>
+                    </a:effectLst>
+                  </pic:spPr>
+                </pic:pic>
+              </a:graphicData>
+            </a:graphic>
+          </wp:inline>
+        </w:drawing>
+      </w:r>
+    </w:p>
+    <w:p>
+      <w:r>
+        <w:br w:type="page"/>
+      </w:r>
+    </w:p>
+    <w:p>
+      <w:pPr>
+        <w:pStyle w:val="Heading2"/>
+      </w:pPr>
+      <w:r>
+        <w:lastRenderedPageBreak/>
+        <w:t>Sprint 3</w:t>
+      </w:r>
+    </w:p>
+    <w:p>
+      <w:r>
+        <w:rPr>
+          <w:noProof/>
+        </w:rPr>
+        <w:drawing>
+          <wp:inline distT="0" distB="0" distL="0" distR="0" wp14:anchorId="4E8551CE" wp14:editId="310CA9CD">
+            <wp:extent cx="5274310" cy="1773555"/>
+            <wp:effectExtent l="152400" t="152400" r="364490" b="360045"/>
+            <wp:docPr id="5" name="Picture 5"/>
+            <wp:cNvGraphicFramePr>
+              <a:graphicFrameLocks xmlns:a="http://schemas.openxmlformats.org/drawingml/2006/main" noChangeAspect="1"/>
+            </wp:cNvGraphicFramePr>
+            <a:graphic xmlns:a="http://schemas.openxmlformats.org/drawingml/2006/main">
+              <a:graphicData uri="http://schemas.openxmlformats.org/drawingml/2006/picture">
+                <pic:pic xmlns:pic="http://schemas.openxmlformats.org/drawingml/2006/picture">
+                  <pic:nvPicPr>
+                    <pic:cNvPr id="0" name="Picture 11"/>
+                    <pic:cNvPicPr>
+                      <a:picLocks noChangeAspect="1" noChangeArrowheads="1"/>
+                    </pic:cNvPicPr>
+                  </pic:nvPicPr>
+                  <pic:blipFill>
+                    <a:blip r:embed="rId9" cstate="print">
+                      <a:extLst>
+                        <a:ext uri="{28A0092B-C50C-407E-A947-70E740481C1C}">
+                          <a14:useLocalDpi xmlns:a14="http://schemas.microsoft.com/office/drawing/2010/main" val="0"/>
+                        </a:ext>
+                      </a:extLst>
+                    </a:blip>
+                    <a:srcRect/>
+                    <a:stretch>
+                      <a:fillRect/>
+                    </a:stretch>
+                  </pic:blipFill>
+                  <pic:spPr bwMode="auto">
+                    <a:xfrm>
+                      <a:off x="0" y="0"/>
+                      <a:ext cx="5274310" cy="1773555"/>
+                    </a:xfrm>
+                    <a:prstGeom prst="rect">
+                      <a:avLst/>
+                    </a:prstGeom>
+                    <a:ln>
+                      <a:noFill/>
+                    </a:ln>
+                    <a:effectLst>
+                      <a:outerShdw blurRad="292100" dist="139700" dir="2700000" algn="tl" rotWithShape="0">
+                        <a:srgbClr val="333333">
+                          <a:alpha val="65000"/>
+                        </a:srgbClr>
+                      </a:outerShdw>
+                    </a:effectLst>
+                  </pic:spPr>
+                </pic:pic>
+              </a:graphicData>
+            </a:graphic>
+          </wp:inline>
+        </w:drawing>
+      </w:r>
+    </w:p>
+    <w:p/>
+    <w:p>
+      <w:pPr>
+        <w:pStyle w:val="Heading2"/>
+      </w:pPr>
+      <w:r>
+        <w:t>Phase II Submission</w:t>
+      </w:r>
+    </w:p>
+    <w:p>
+      <w:pPr>
+        <w:jc w:val="both"/>
+      </w:pPr>
+      <w:r>
+        <w:rPr>
+          <w:noProof/>
+        </w:rPr>
+        <w:drawing>
+          <wp:inline distT="0" distB="0" distL="0" distR="0" wp14:anchorId="560972D9" wp14:editId="73108831">
+            <wp:extent cx="5274310" cy="1266825"/>
+            <wp:effectExtent l="152400" t="152400" r="364490" b="371475"/>
+            <wp:docPr id="6" name="Picture 6"/>
+            <wp:cNvGraphicFramePr>
+              <a:graphicFrameLocks xmlns:a="http://schemas.openxmlformats.org/drawingml/2006/main" noChangeAspect="1"/>
+            </wp:cNvGraphicFramePr>
+            <a:graphic xmlns:a="http://schemas.openxmlformats.org/drawingml/2006/main">
+              <a:graphicData uri="http://schemas.openxmlformats.org/drawingml/2006/picture">
+                <pic:pic xmlns:pic="http://schemas.openxmlformats.org/drawingml/2006/picture">
+                  <pic:nvPicPr>
+                    <pic:cNvPr id="0" name="Picture 13"/>
+                    <pic:cNvPicPr>
+                      <a:picLocks noChangeAspect="1" noChangeArrowheads="1"/>
+                    </pic:cNvPicPr>
+                  </pic:nvPicPr>
+                  <pic:blipFill>
+                    <a:blip r:embed="rId10" cstate="print">
+                      <a:extLst>
+                        <a:ext uri="{28A0092B-C50C-407E-A947-70E740481C1C}">
+                          <a14:useLocalDpi xmlns:a14="http://schemas.microsoft.com/office/drawing/2010/main" val="0"/>
+                        </a:ext>
+                      </a:extLst>
+                    </a:blip>
+                    <a:srcRect/>
+                    <a:stretch>
+                      <a:fillRect/>
+                    </a:stretch>
+                  </pic:blipFill>
+                  <pic:spPr bwMode="auto">
+                    <a:xfrm>
+                      <a:off x="0" y="0"/>
+                      <a:ext cx="5274310" cy="1266825"/>
+                    </a:xfrm>
+                    <a:prstGeom prst="rect">
+                      <a:avLst/>
+                    </a:prstGeom>
+                    <a:ln>
+                      <a:noFill/>
+                    </a:ln>
+                    <a:effectLst>
+                      <a:outerShdw blurRad="292100" dist="139700" dir="2700000" algn="tl" rotWithShape="0">
+                        <a:srgbClr val="333333">
+                          <a:alpha val="65000"/>
+                        </a:srgbClr>
+                      </a:outerShdw>
+                    </a:effectLst>
+                  </pic:spPr>
+                </pic:pic>
+              </a:graphicData>
+            </a:graphic>
+          </wp:inline>
+        </w:drawing>
+      </w:r>
     </w:p>
     <w:sectPr>
       <w:pgSz w:w="11906" w:h="16838"/>
@@ -452,6 +987,92 @@
     </w:lvl>
   </w:abstractNum>
   <w:abstractNum w:abstractNumId="4" w15:restartNumberingAfterBreak="0">
+    <w:nsid w:val="6C48557D"/>
+    <w:multiLevelType w:val="hybridMultilevel"/>
+    <w:tmpl w:val="C330815A"/>
+    <w:lvl w:ilvl="0" w:tplc="0409000F">
+      <w:start w:val="1"/>
+      <w:numFmt w:val="decimal"/>
+      <w:lvlText w:val="%1."/>
+      <w:lvlJc w:val="left"/>
+      <w:pPr>
+        <w:ind w:left="720" w:hanging="360"/>
+      </w:pPr>
+    </w:lvl>
+    <w:lvl w:ilvl="1" w:tplc="04090019" w:tentative="1">
+      <w:start w:val="1"/>
+      <w:numFmt w:val="lowerLetter"/>
+      <w:lvlText w:val="%2."/>
+      <w:lvlJc w:val="left"/>
+      <w:pPr>
+        <w:ind w:left="1440" w:hanging="360"/>
+      </w:pPr>
+    </w:lvl>
+    <w:lvl w:ilvl="2" w:tplc="0409001B" w:tentative="1">
+      <w:start w:val="1"/>
+      <w:numFmt w:val="lowerRoman"/>
+      <w:lvlText w:val="%3."/>
+      <w:lvlJc w:val="right"/>
+      <w:pPr>
+        <w:ind w:left="2160" w:hanging="180"/>
+      </w:pPr>
+    </w:lvl>
+    <w:lvl w:ilvl="3" w:tplc="0409000F" w:tentative="1">
+      <w:start w:val="1"/>
+      <w:numFmt w:val="decimal"/>
+      <w:lvlText w:val="%4."/>
+      <w:lvlJc w:val="left"/>
+      <w:pPr>
+        <w:ind w:left="2880" w:hanging="360"/>
+      </w:pPr>
+    </w:lvl>
+    <w:lvl w:ilvl="4" w:tplc="04090019" w:tentative="1">
+      <w:start w:val="1"/>
+      <w:numFmt w:val="lowerLetter"/>
+      <w:lvlText w:val="%5."/>
+      <w:lvlJc w:val="left"/>
+      <w:pPr>
+        <w:ind w:left="3600" w:hanging="360"/>
+      </w:pPr>
+    </w:lvl>
+    <w:lvl w:ilvl="5" w:tplc="0409001B" w:tentative="1">
+      <w:start w:val="1"/>
+      <w:numFmt w:val="lowerRoman"/>
+      <w:lvlText w:val="%6."/>
+      <w:lvlJc w:val="right"/>
+      <w:pPr>
+        <w:ind w:left="4320" w:hanging="180"/>
+      </w:pPr>
+    </w:lvl>
+    <w:lvl w:ilvl="6" w:tplc="0409000F" w:tentative="1">
+      <w:start w:val="1"/>
+      <w:numFmt w:val="decimal"/>
+      <w:lvlText w:val="%7."/>
+      <w:lvlJc w:val="left"/>
+      <w:pPr>
+        <w:ind w:left="5040" w:hanging="360"/>
+      </w:pPr>
+    </w:lvl>
+    <w:lvl w:ilvl="7" w:tplc="04090019" w:tentative="1">
+      <w:start w:val="1"/>
+      <w:numFmt w:val="lowerLetter"/>
+      <w:lvlText w:val="%8."/>
+      <w:lvlJc w:val="left"/>
+      <w:pPr>
+        <w:ind w:left="5760" w:hanging="360"/>
+      </w:pPr>
+    </w:lvl>
+    <w:lvl w:ilvl="8" w:tplc="0409001B" w:tentative="1">
+      <w:start w:val="1"/>
+      <w:numFmt w:val="lowerRoman"/>
+      <w:lvlText w:val="%9."/>
+      <w:lvlJc w:val="right"/>
+      <w:pPr>
+        <w:ind w:left="6480" w:hanging="180"/>
+      </w:pPr>
+    </w:lvl>
+  </w:abstractNum>
+  <w:abstractNum w:abstractNumId="5" w15:restartNumberingAfterBreak="0">
     <w:nsid w:val="770A7D0A"/>
     <w:multiLevelType w:val="hybridMultilevel"/>
     <w:tmpl w:val="7E7E23B6"/>
@@ -553,6 +1174,9 @@
     <w:abstractNumId w:val="2"/>
   </w:num>
   <w:num w:numId="5" w16cid:durableId="402488303">
+    <w:abstractNumId w:val="5"/>
+  </w:num>
+  <w:num w:numId="6" w16cid:durableId="272516553">
     <w:abstractNumId w:val="4"/>
   </w:num>
 </w:numbering>

</xml_diff>